<commit_message>
Render pipe tables in FE instructions and lesson cells; keep-with-next; PIPE-RAW validator
Co-Authored-By: Claude Sonnet 5.5 <noreply@anthropic.com>
</commit_message>
<xml_diff>
--- a/data/outputs/v2/Biology/SS1.1_Cell_Structure/Biology_Cell_Structure_FinalExplanation.docx
+++ b/data/outputs/v2/Biology/SS1.1_Cell_Structure/Biology_Cell_Structure_FinalExplanation.docx
@@ -4,6 +4,7 @@
   <w:body>
     <w:p>
       <w:pPr>
+        <w:keepNext w:val="false"/>
         <w:spacing w:after="30" w:before="0"/>
         <w:jc w:val="center"/>
       </w:pPr>
@@ -23,6 +24,7 @@
     </w:p>
     <w:p>
       <w:pPr>
+        <w:keepNext w:val="false"/>
         <w:spacing w:after="60" w:before="0"/>
         <w:jc w:val="center"/>
       </w:pPr>
@@ -81,6 +83,7 @@
           </w:tcPr>
           <w:p>
             <w:pPr>
+              <w:keepNext w:val="false"/>
               <w:spacing w:after="40" w:before="0"/>
               <w:jc w:val="center"/>
             </w:pPr>
@@ -116,6 +119,7 @@
           </w:tcPr>
           <w:p>
             <w:pPr>
+              <w:keepNext w:val="false"/>
               <w:spacing w:after="40" w:before="0"/>
               <w:jc w:val="center"/>
             </w:pPr>
@@ -150,6 +154,7 @@
           </w:tcPr>
           <w:p>
             <w:pPr>
+              <w:keepNext w:val="false"/>
               <w:spacing w:after="40" w:before="0"/>
               <w:jc w:val="left"/>
             </w:pPr>
@@ -182,6 +187,7 @@
           </w:tcPr>
           <w:p>
             <w:pPr>
+              <w:keepNext w:val="false"/>
               <w:spacing w:after="40" w:before="0"/>
               <w:jc w:val="left"/>
             </w:pPr>
@@ -216,6 +222,7 @@
           </w:tcPr>
           <w:p>
             <w:pPr>
+              <w:keepNext w:val="false"/>
               <w:spacing w:after="40" w:before="0"/>
               <w:jc w:val="left"/>
             </w:pPr>
@@ -248,6 +255,7 @@
           </w:tcPr>
           <w:p>
             <w:pPr>
+              <w:keepNext w:val="false"/>
               <w:spacing w:after="40" w:before="0"/>
               <w:jc w:val="left"/>
             </w:pPr>
@@ -282,6 +290,7 @@
           </w:tcPr>
           <w:p>
             <w:pPr>
+              <w:keepNext w:val="false"/>
               <w:spacing w:after="40" w:before="0"/>
               <w:jc w:val="left"/>
             </w:pPr>
@@ -314,6 +323,7 @@
           </w:tcPr>
           <w:p>
             <w:pPr>
+              <w:keepNext w:val="false"/>
               <w:spacing w:after="40" w:before="0"/>
               <w:jc w:val="left"/>
             </w:pPr>
@@ -374,6 +384,7 @@
           </w:tcPr>
           <w:p>
             <w:pPr>
+              <w:keepNext w:val="false"/>
               <w:spacing w:after="40" w:before="0"/>
               <w:jc w:val="center"/>
             </w:pPr>
@@ -408,6 +419,7 @@
           </w:tcPr>
           <w:p>
             <w:pPr>
+              <w:keepNext w:val="false"/>
               <w:spacing w:after="40" w:before="0"/>
               <w:jc w:val="left"/>
             </w:pPr>
@@ -467,6 +479,7 @@
           </w:tcPr>
           <w:p>
             <w:pPr>
+              <w:keepNext/>
               <w:spacing w:after="40" w:before="0"/>
               <w:jc w:val="center"/>
             </w:pPr>
@@ -501,6 +514,7 @@
           </w:tcPr>
           <w:p>
             <w:pPr>
+              <w:keepNext/>
               <w:spacing w:after="40" w:before="0"/>
               <w:jc w:val="left"/>
             </w:pPr>
@@ -538,6 +552,7 @@
           </w:tcPr>
           <w:p>
             <w:pPr>
+              <w:keepNext w:val="false"/>
               <w:spacing w:after="40" w:before="0"/>
               <w:jc w:val="left"/>
             </w:pPr>
@@ -597,6 +612,7 @@
           </w:tcPr>
           <w:p>
             <w:pPr>
+              <w:keepNext/>
               <w:spacing w:after="40" w:before="0"/>
               <w:jc w:val="center"/>
             </w:pPr>
@@ -631,6 +647,7 @@
           </w:tcPr>
           <w:p>
             <w:pPr>
+              <w:keepNext/>
               <w:spacing w:after="40" w:before="0"/>
               <w:jc w:val="left"/>
             </w:pPr>
@@ -668,6 +685,7 @@
           </w:tcPr>
           <w:p>
             <w:pPr>
+              <w:keepNext w:val="false"/>
               <w:spacing w:after="40" w:before="0"/>
               <w:jc w:val="left"/>
             </w:pPr>
@@ -727,6 +745,7 @@
           </w:tcPr>
           <w:p>
             <w:pPr>
+              <w:keepNext/>
               <w:spacing w:after="40" w:before="0"/>
               <w:jc w:val="center"/>
             </w:pPr>
@@ -761,6 +780,7 @@
           </w:tcPr>
           <w:p>
             <w:pPr>
+              <w:keepNext/>
               <w:spacing w:after="40" w:before="0"/>
               <w:jc w:val="left"/>
             </w:pPr>
@@ -798,6 +818,7 @@
           </w:tcPr>
           <w:p>
             <w:pPr>
+              <w:keepNext w:val="false"/>
               <w:spacing w:after="40" w:before="0"/>
               <w:jc w:val="left"/>
             </w:pPr>
@@ -857,6 +878,7 @@
           </w:tcPr>
           <w:p>
             <w:pPr>
+              <w:keepNext/>
               <w:spacing w:after="40" w:before="0"/>
               <w:jc w:val="center"/>
             </w:pPr>
@@ -891,6 +913,7 @@
           </w:tcPr>
           <w:p>
             <w:pPr>
+              <w:keepNext/>
               <w:spacing w:after="40" w:before="0"/>
               <w:jc w:val="left"/>
             </w:pPr>
@@ -928,6 +951,7 @@
           </w:tcPr>
           <w:p>
             <w:pPr>
+              <w:keepNext w:val="false"/>
               <w:spacing w:after="40" w:before="0"/>
               <w:jc w:val="left"/>
             </w:pPr>
@@ -987,6 +1011,7 @@
           </w:tcPr>
           <w:p>
             <w:pPr>
+              <w:keepNext/>
               <w:spacing w:after="40" w:before="0"/>
               <w:jc w:val="center"/>
             </w:pPr>
@@ -1021,6 +1046,7 @@
           </w:tcPr>
           <w:p>
             <w:pPr>
+              <w:keepNext/>
               <w:spacing w:after="40" w:before="0"/>
               <w:jc w:val="left"/>
             </w:pPr>
@@ -1058,6 +1084,7 @@
           </w:tcPr>
           <w:p>
             <w:pPr>
+              <w:keepNext w:val="false"/>
               <w:spacing w:after="40" w:before="0"/>
               <w:jc w:val="left"/>
             </w:pPr>
@@ -1121,6 +1148,7 @@
           </w:tcPr>
           <w:p>
             <w:pPr>
+              <w:keepNext w:val="false"/>
               <w:spacing w:after="40" w:before="0"/>
               <w:jc w:val="center"/>
             </w:pPr>
@@ -1155,6 +1183,7 @@
           </w:tcPr>
           <w:p>
             <w:pPr>
+              <w:keepNext w:val="false"/>
               <w:spacing w:after="40" w:before="0"/>
               <w:jc w:val="left"/>
             </w:pPr>
@@ -1187,6 +1216,7 @@
           </w:tcPr>
           <w:p>
             <w:pPr>
+              <w:keepNext w:val="false"/>
               <w:spacing w:after="40" w:before="0"/>
               <w:jc w:val="left"/>
             </w:pPr>
@@ -1219,6 +1249,7 @@
           </w:tcPr>
           <w:p>
             <w:pPr>
+              <w:keepNext w:val="false"/>
               <w:spacing w:after="40" w:before="0"/>
               <w:jc w:val="left"/>
             </w:pPr>
@@ -1251,6 +1282,7 @@
           </w:tcPr>
           <w:p>
             <w:pPr>
+              <w:keepNext w:val="false"/>
               <w:spacing w:after="40" w:before="0"/>
               <w:jc w:val="left"/>
             </w:pPr>
@@ -1285,6 +1317,7 @@
           </w:tcPr>
           <w:p>
             <w:pPr>
+              <w:keepNext w:val="false"/>
               <w:spacing w:after="40" w:before="0"/>
               <w:jc w:val="left"/>
             </w:pPr>
@@ -1317,6 +1350,7 @@
           </w:tcPr>
           <w:p>
             <w:pPr>
+              <w:keepNext w:val="false"/>
               <w:spacing w:after="40" w:before="0"/>
               <w:jc w:val="left"/>
             </w:pPr>
@@ -1349,6 +1383,7 @@
           </w:tcPr>
           <w:p>
             <w:pPr>
+              <w:keepNext w:val="false"/>
               <w:spacing w:after="40" w:before="0"/>
               <w:jc w:val="left"/>
             </w:pPr>
@@ -1381,6 +1416,7 @@
           </w:tcPr>
           <w:p>
             <w:pPr>
+              <w:keepNext w:val="false"/>
               <w:spacing w:after="40" w:before="0"/>
               <w:jc w:val="left"/>
             </w:pPr>
@@ -1415,6 +1451,7 @@
           </w:tcPr>
           <w:p>
             <w:pPr>
+              <w:keepNext w:val="false"/>
               <w:spacing w:after="40" w:before="0"/>
               <w:jc w:val="left"/>
             </w:pPr>
@@ -1447,6 +1484,7 @@
           </w:tcPr>
           <w:p>
             <w:pPr>
+              <w:keepNext w:val="false"/>
               <w:spacing w:after="40" w:before="0"/>
               <w:jc w:val="left"/>
             </w:pPr>
@@ -1479,6 +1517,7 @@
           </w:tcPr>
           <w:p>
             <w:pPr>
+              <w:keepNext w:val="false"/>
               <w:spacing w:after="40" w:before="0"/>
               <w:jc w:val="left"/>
             </w:pPr>
@@ -1511,6 +1550,7 @@
           </w:tcPr>
           <w:p>
             <w:pPr>
+              <w:keepNext w:val="false"/>
               <w:spacing w:after="40" w:before="0"/>
               <w:jc w:val="left"/>
             </w:pPr>
@@ -1545,6 +1585,7 @@
           </w:tcPr>
           <w:p>
             <w:pPr>
+              <w:keepNext w:val="false"/>
               <w:spacing w:after="40" w:before="0"/>
               <w:jc w:val="left"/>
             </w:pPr>
@@ -1577,6 +1618,7 @@
           </w:tcPr>
           <w:p>
             <w:pPr>
+              <w:keepNext w:val="false"/>
               <w:spacing w:after="40" w:before="0"/>
               <w:jc w:val="left"/>
             </w:pPr>
@@ -1609,6 +1651,7 @@
           </w:tcPr>
           <w:p>
             <w:pPr>
+              <w:keepNext w:val="false"/>
               <w:spacing w:after="40" w:before="0"/>
               <w:jc w:val="left"/>
             </w:pPr>
@@ -1641,6 +1684,7 @@
           </w:tcPr>
           <w:p>
             <w:pPr>
+              <w:keepNext w:val="false"/>
               <w:spacing w:after="40" w:before="0"/>
               <w:jc w:val="left"/>
             </w:pPr>
@@ -1675,6 +1719,7 @@
           </w:tcPr>
           <w:p>
             <w:pPr>
+              <w:keepNext w:val="false"/>
               <w:spacing w:after="40" w:before="0"/>
               <w:jc w:val="left"/>
             </w:pPr>
@@ -1707,6 +1752,7 @@
           </w:tcPr>
           <w:p>
             <w:pPr>
+              <w:keepNext w:val="false"/>
               <w:spacing w:after="40" w:before="0"/>
               <w:jc w:val="left"/>
             </w:pPr>
@@ -1739,6 +1785,7 @@
           </w:tcPr>
           <w:p>
             <w:pPr>
+              <w:keepNext w:val="false"/>
               <w:spacing w:after="40" w:before="0"/>
               <w:jc w:val="left"/>
             </w:pPr>
@@ -1771,6 +1818,7 @@
           </w:tcPr>
           <w:p>
             <w:pPr>
+              <w:keepNext w:val="false"/>
               <w:spacing w:after="40" w:before="0"/>
               <w:jc w:val="left"/>
             </w:pPr>
@@ -1805,6 +1853,7 @@
           </w:tcPr>
           <w:p>
             <w:pPr>
+              <w:keepNext w:val="false"/>
               <w:spacing w:after="40" w:before="0"/>
               <w:jc w:val="left"/>
             </w:pPr>
@@ -1837,6 +1886,7 @@
           </w:tcPr>
           <w:p>
             <w:pPr>
+              <w:keepNext w:val="false"/>
               <w:spacing w:after="40" w:before="0"/>
               <w:jc w:val="left"/>
             </w:pPr>
@@ -1869,6 +1919,7 @@
           </w:tcPr>
           <w:p>
             <w:pPr>
+              <w:keepNext w:val="false"/>
               <w:spacing w:after="40" w:before="0"/>
               <w:jc w:val="left"/>
             </w:pPr>
@@ -1901,6 +1952,7 @@
           </w:tcPr>
           <w:p>
             <w:pPr>
+              <w:keepNext w:val="false"/>
               <w:spacing w:after="40" w:before="0"/>
               <w:jc w:val="left"/>
             </w:pPr>
@@ -2039,7 +2091,7 @@
         </w:rPr>
         <w:t xml:space="preserve">© 2026 SeaVuria and ARES. This work is licensed under a </w:t>
       </w:r>
-      <w:hyperlink w:history="1" r:id="rId6byqun3pyuz6xwobcorg7">
+      <w:hyperlink w:history="1" r:id="rId91xxkd27nnh_nbieu6x2w">
         <w:r>
           <w:rPr>
             <w:rFonts w:ascii="Arial" w:cs="Arial" w:eastAsia="Arial" w:hAnsi="Arial"/>
@@ -2059,7 +2111,7 @@
         </w:rPr>
         <w:t xml:space="preserve"> (</w:t>
       </w:r>
-      <w:hyperlink w:history="1" r:id="rIdfqu8t3gm1x_gpiatm1egw">
+      <w:hyperlink w:history="1" r:id="rId5fuq7jhf05xphuf729ghr">
         <w:r>
           <w:rPr>
             <w:rFonts w:ascii="Arial" w:cs="Arial" w:eastAsia="Arial" w:hAnsi="Arial"/>
@@ -2079,7 +2131,7 @@
         </w:rPr>
         <w:t xml:space="preserve">). To view a copy of this license, visit </w:t>
       </w:r>
-      <w:hyperlink w:history="1" r:id="rId-0mkdih4id6cnkztwpy1a">
+      <w:hyperlink w:history="1" r:id="rIdbrmuvixa4guxmivlzyyhv">
         <w:r>
           <w:rPr>
             <w:rFonts w:ascii="Arial" w:cs="Arial" w:eastAsia="Arial" w:hAnsi="Arial"/>

</xml_diff>